<commit_message>
Atualiza template do orçamento
</commit_message>
<xml_diff>
--- a/src/assets/budget/template_orcamento.docx
+++ b/src/assets/budget/template_orcamento.docx
@@ -3534,15 +3534,15 @@
     <w:tbl>
       <w:tblPr>
         <w:tblStyle w:val="TableGrid0"/>
-        <w:tblW w:w="0" w:type="auto"/>
+        <w:tblW w:w="8757" w:type="dxa"/>
         <w:tblLayout w:type="fixed"/>
         <w:tblLook w:val="04A0" w:firstRow="1" w:lastRow="0" w:firstColumn="1" w:lastColumn="0" w:noHBand="0" w:noVBand="1"/>
       </w:tblPr>
       <w:tblGrid>
         <w:gridCol w:w="500"/>
         <w:gridCol w:w="4480"/>
-        <w:gridCol w:w="1604"/>
-        <w:gridCol w:w="2173"/>
+        <w:gridCol w:w="1961"/>
+        <w:gridCol w:w="1816"/>
       </w:tblGrid>
       <w:tr>
         <w:trPr>
@@ -3550,7 +3550,7 @@
         </w:trPr>
         <w:tc>
           <w:tcPr>
-            <w:tcW w:w="4480" w:type="dxa"/>
+            <w:tcW w:w="4980" w:type="dxa"/>
             <w:gridSpan w:val="2"/>
             <w:shd w:val="clear" w:color="auto" w:fill="DAE9F7" w:themeFill="text2" w:themeFillTint="1A"/>
           </w:tcPr>
@@ -3565,18 +3565,21 @@
             </w:pPr>
             <w:r>
               <w:rPr>
-                <w:rFonts w:ascii="Calibri" w:eastAsia="Calibri" w:hAnsi="Calibri" w:cs="Calibri"/>
+                <w:rFonts w:ascii="Calibri" w:hAnsi="Calibri" w:cs="Calibri"/>
                 <w:b/>
+                <w:bCs/>
+                <w:color w:val="000000"/>
                 <w:sz w:val="20"/>
                 <w:szCs w:val="20"/>
-              </w:rPr>
-              <w:t>PROTOCOLO MICRORGANISMOS</w:t>
-            </w:r>
-          </w:p>
-        </w:tc>
-        <w:tc>
-          <w:tcPr>
-            <w:tcW w:w="1604" w:type="dxa"/>
+                <w:shd w:val="clear" w:color="auto" w:fill="DAE9F7"/>
+              </w:rPr>
+              <w:t>Terapêuticas para detoxificação</w:t>
+            </w:r>
+          </w:p>
+        </w:tc>
+        <w:tc>
+          <w:tcPr>
+            <w:tcW w:w="1961" w:type="dxa"/>
             <w:shd w:val="clear" w:color="auto" w:fill="DAE9F7" w:themeFill="text2" w:themeFillTint="1A"/>
           </w:tcPr>
           <w:p>
@@ -3590,38 +3593,197 @@
             </w:pPr>
             <w:r>
               <w:rPr>
-                <w:rFonts w:ascii="Calibri" w:eastAsia="Calibri" w:hAnsi="Calibri" w:cs="Calibri"/>
+                <w:rFonts w:ascii="Calibri" w:hAnsi="Calibri" w:cs="Calibri"/>
                 <w:b/>
+                <w:bCs/>
+                <w:color w:val="000000"/>
+                <w:sz w:val="14"/>
+                <w:szCs w:val="14"/>
+                <w:shd w:val="clear" w:color="auto" w:fill="DAE9F7"/>
+              </w:rPr>
+              <w:t>Valor no pix</w:t>
+            </w:r>
+          </w:p>
+        </w:tc>
+        <w:tc>
+          <w:tcPr>
+            <w:tcW w:w="1816" w:type="dxa"/>
+            <w:shd w:val="clear" w:color="auto" w:fill="DAE9F7" w:themeFill="text2" w:themeFillTint="1A"/>
+          </w:tcPr>
+          <w:p>
+            <w:pPr>
+              <w:jc w:val="center"/>
+              <w:rPr>
+                <w:rFonts w:ascii="Calibri" w:hAnsi="Calibri" w:cs="Calibri"/>
                 <w:sz w:val="20"/>
                 <w:szCs w:val="20"/>
               </w:rPr>
-              <w:t>PIX</w:t>
-            </w:r>
-          </w:p>
-        </w:tc>
-        <w:tc>
-          <w:tcPr>
-            <w:tcW w:w="2173" w:type="dxa"/>
-            <w:shd w:val="clear" w:color="auto" w:fill="DAE9F7" w:themeFill="text2" w:themeFillTint="1A"/>
-          </w:tcPr>
-          <w:p>
-            <w:pPr>
-              <w:jc w:val="center"/>
-              <w:rPr>
-                <w:rFonts w:ascii="Calibri" w:hAnsi="Calibri" w:cs="Calibri"/>
-                <w:sz w:val="20"/>
-                <w:szCs w:val="20"/>
-              </w:rPr>
-            </w:pPr>
-            <w:r>
-              <w:rPr>
-                <w:rFonts w:ascii="Calibri" w:eastAsia="Calibri" w:hAnsi="Calibri" w:cs="Calibri"/>
+            </w:pPr>
+            <w:r>
+              <w:rPr>
+                <w:rFonts w:ascii="Calibri" w:hAnsi="Calibri" w:cs="Calibri"/>
                 <w:b/>
-                <w:sz w:val="20"/>
-                <w:szCs w:val="20"/>
-              </w:rPr>
-              <w:t>CARTÃO</w:t>
-            </w:r>
+                <w:bCs/>
+                <w:color w:val="000000"/>
+                <w:sz w:val="14"/>
+                <w:szCs w:val="14"/>
+                <w:shd w:val="clear" w:color="auto" w:fill="DAE9F7"/>
+              </w:rPr>
+              <w:t>V</w:t>
+            </w:r>
+            <w:r>
+              <w:rPr>
+                <w:rFonts w:ascii="Calibri" w:hAnsi="Calibri" w:cs="Calibri"/>
+                <w:b/>
+                <w:bCs/>
+                <w:color w:val="000000"/>
+                <w:sz w:val="14"/>
+                <w:szCs w:val="14"/>
+                <w:shd w:val="clear" w:color="auto" w:fill="DAE9F7"/>
+              </w:rPr>
+              <w:t>alor no crédito</w:t>
+            </w:r>
+          </w:p>
+        </w:tc>
+      </w:tr>
+      <w:tr>
+        <w:trPr>
+          <w:trHeight w:val="49"/>
+        </w:trPr>
+        <w:tc>
+          <w:tcPr>
+            <w:tcW w:w="500" w:type="dxa"/>
+          </w:tcPr>
+          <w:p>
+            <w:pPr>
+              <w:rPr>
+                <w:rFonts w:ascii="Calibri" w:hAnsi="Calibri" w:cs="Calibri"/>
+                <w:sz w:val="18"/>
+                <w:szCs w:val="18"/>
+                <w:lang w:val="en-US"/>
+              </w:rPr>
+            </w:pPr>
+          </w:p>
+        </w:tc>
+        <w:tc>
+          <w:tcPr>
+            <w:tcW w:w="4480" w:type="dxa"/>
+          </w:tcPr>
+          <w:p>
+            <w:pPr>
+              <w:rPr>
+                <w:rFonts w:ascii="Calibri" w:hAnsi="Calibri" w:cs="Calibri"/>
+                <w:sz w:val="18"/>
+                <w:szCs w:val="18"/>
+                <w:lang w:val="en-US"/>
+              </w:rPr>
+            </w:pPr>
+            <w:r>
+              <w:rPr>
+                <w:rFonts w:ascii="Calibri" w:eastAsia="Calibri" w:hAnsi="Calibri" w:cs="Calibri"/>
+                <w:sz w:val="14"/>
+                <w:szCs w:val="18"/>
+                <w:lang w:val="en-US"/>
+              </w:rPr>
+              <w:t>{%</w:t>
+            </w:r>
+            <w:r>
+              <w:rPr>
+                <w:rFonts w:ascii="Calibri" w:eastAsia="Calibri" w:hAnsi="Calibri" w:cs="Calibri"/>
+                <w:sz w:val="14"/>
+                <w:szCs w:val="18"/>
+                <w:lang w:val="en-US"/>
+              </w:rPr>
+              <w:t>tr</w:t>
+            </w:r>
+            <w:r>
+              <w:rPr>
+                <w:rFonts w:ascii="Calibri" w:eastAsia="Calibri" w:hAnsi="Calibri" w:cs="Calibri"/>
+                <w:sz w:val="14"/>
+                <w:szCs w:val="18"/>
+                <w:lang w:val="en-US"/>
+              </w:rPr>
+              <w:t xml:space="preserve"> for </w:t>
+            </w:r>
+            <w:proofErr w:type="spellStart"/>
+            <w:r>
+              <w:rPr>
+                <w:rFonts w:ascii="Calibri" w:eastAsia="Calibri" w:hAnsi="Calibri" w:cs="Calibri"/>
+                <w:sz w:val="14"/>
+                <w:szCs w:val="18"/>
+                <w:lang w:val="en-US"/>
+              </w:rPr>
+              <w:t>i</w:t>
+            </w:r>
+            <w:proofErr w:type="spellEnd"/>
+            <w:r>
+              <w:rPr>
+                <w:rFonts w:ascii="Calibri" w:eastAsia="Calibri" w:hAnsi="Calibri" w:cs="Calibri"/>
+                <w:sz w:val="14"/>
+                <w:szCs w:val="18"/>
+                <w:lang w:val="en-US"/>
+              </w:rPr>
+              <w:t xml:space="preserve"> in </w:t>
+            </w:r>
+            <w:proofErr w:type="spellStart"/>
+            <w:r>
+              <w:rPr>
+                <w:rFonts w:ascii="Calibri" w:eastAsia="Calibri" w:hAnsi="Calibri" w:cs="Calibri"/>
+                <w:sz w:val="14"/>
+                <w:szCs w:val="18"/>
+                <w:lang w:val="en-US"/>
+              </w:rPr>
+              <w:t>microorganisms_</w:t>
+            </w:r>
+            <w:r>
+              <w:rPr>
+                <w:rFonts w:ascii="Calibri" w:eastAsia="Calibri" w:hAnsi="Calibri" w:cs="Calibri"/>
+                <w:sz w:val="14"/>
+                <w:szCs w:val="18"/>
+                <w:lang w:val="en-US"/>
+              </w:rPr>
+              <w:t>budget</w:t>
+            </w:r>
+            <w:proofErr w:type="spellEnd"/>
+            <w:r>
+              <w:rPr>
+                <w:rFonts w:ascii="Calibri" w:eastAsia="Calibri" w:hAnsi="Calibri" w:cs="Calibri"/>
+                <w:sz w:val="14"/>
+                <w:szCs w:val="18"/>
+                <w:lang w:val="en-US"/>
+              </w:rPr>
+              <w:t xml:space="preserve"> %}</w:t>
+            </w:r>
+          </w:p>
+        </w:tc>
+        <w:tc>
+          <w:tcPr>
+            <w:tcW w:w="1961" w:type="dxa"/>
+          </w:tcPr>
+          <w:p>
+            <w:pPr>
+              <w:rPr>
+                <w:rFonts w:ascii="Calibri" w:hAnsi="Calibri" w:cs="Calibri"/>
+                <w:sz w:val="18"/>
+                <w:szCs w:val="18"/>
+                <w:lang w:val="en-US"/>
+              </w:rPr>
+            </w:pPr>
+          </w:p>
+        </w:tc>
+        <w:tc>
+          <w:tcPr>
+            <w:tcW w:w="1816" w:type="dxa"/>
+          </w:tcPr>
+          <w:p>
+            <w:pPr>
+              <w:rPr>
+                <w:rFonts w:ascii="Calibri" w:hAnsi="Calibri" w:cs="Calibri"/>
+                <w:sz w:val="18"/>
+                <w:szCs w:val="18"/>
+                <w:lang w:val="en-US"/>
+              </w:rPr>
+            </w:pPr>
           </w:p>
         </w:tc>
       </w:tr>
@@ -3632,16 +3794,197 @@
         <w:tc>
           <w:tcPr>
             <w:tcW w:w="500" w:type="dxa"/>
-          </w:tcPr>
-          <w:p>
-            <w:pPr>
-              <w:rPr>
-                <w:rFonts w:ascii="Calibri" w:hAnsi="Calibri" w:cs="Calibri"/>
+            <w:vMerge w:val="restart"/>
+          </w:tcPr>
+          <w:p>
+            <w:pPr>
+              <w:jc w:val="center"/>
+            </w:pPr>
+            <w:r>
+              <w:rPr>
+                <w:rFonts w:ascii="Calibri" w:eastAsia="Calibri" w:hAnsi="Calibri"/>
+                <w:b/>
+                <w:sz w:val="14"/>
+              </w:rPr>
+              <w:t>{{</w:t>
+            </w:r>
+            <w:proofErr w:type="spellStart"/>
+            <w:proofErr w:type="gramStart"/>
+            <w:r>
+              <w:rPr>
+                <w:rFonts w:ascii="Calibri" w:eastAsia="Calibri" w:hAnsi="Calibri"/>
+                <w:b/>
+                <w:sz w:val="14"/>
+              </w:rPr>
+              <w:t>i.number</w:t>
+            </w:r>
+            <w:proofErr w:type="spellEnd"/>
+            <w:proofErr w:type="gramEnd"/>
+            <w:r>
+              <w:rPr>
+                <w:rFonts w:ascii="Calibri" w:eastAsia="Calibri" w:hAnsi="Calibri"/>
+                <w:b/>
+                <w:sz w:val="14"/>
+              </w:rPr>
+              <w:t>}}</w:t>
+            </w:r>
+          </w:p>
+        </w:tc>
+        <w:tc>
+          <w:tcPr>
+            <w:tcW w:w="4480" w:type="dxa"/>
+          </w:tcPr>
+          <w:p>
+            <w:pPr>
+              <w:rPr>
+                <w:rFonts w:ascii="Calibri" w:hAnsi="Calibri" w:cs="Calibri"/>
+                <w:b/>
+                <w:bCs/>
                 <w:sz w:val="18"/>
                 <w:szCs w:val="18"/>
                 <w:lang w:val="en-US"/>
               </w:rPr>
             </w:pPr>
+            <w:r>
+              <w:rPr>
+                <w:rFonts w:ascii="Calibri" w:eastAsia="Calibri" w:hAnsi="Calibri" w:cs="Calibri"/>
+                <w:sz w:val="14"/>
+                <w:szCs w:val="18"/>
+                <w:lang w:val="en-US"/>
+              </w:rPr>
+              <w:t>{{i</w:t>
+            </w:r>
+            <w:r>
+              <w:rPr>
+                <w:rFonts w:ascii="Calibri" w:eastAsia="Calibri" w:hAnsi="Calibri" w:cs="Calibri"/>
+                <w:sz w:val="14"/>
+                <w:szCs w:val="18"/>
+                <w:lang w:val="en-US"/>
+              </w:rPr>
+              <w:t>.name</w:t>
+            </w:r>
+            <w:r>
+              <w:rPr>
+                <w:rFonts w:ascii="Calibri" w:eastAsia="Calibri" w:hAnsi="Calibri" w:cs="Calibri"/>
+                <w:sz w:val="14"/>
+                <w:szCs w:val="18"/>
+                <w:lang w:val="en-US"/>
+              </w:rPr>
+              <w:t>}}</w:t>
+            </w:r>
+          </w:p>
+        </w:tc>
+        <w:tc>
+          <w:tcPr>
+            <w:tcW w:w="1961" w:type="dxa"/>
+          </w:tcPr>
+          <w:p>
+            <w:pPr>
+              <w:jc w:val="center"/>
+              <w:rPr>
+                <w:rFonts w:ascii="Calibri" w:hAnsi="Calibri" w:cs="Calibri"/>
+                <w:sz w:val="18"/>
+                <w:szCs w:val="18"/>
+                <w:lang w:val="en-US"/>
+              </w:rPr>
+            </w:pPr>
+            <w:r>
+              <w:rPr>
+                <w:rFonts w:ascii="Calibri" w:eastAsia="Calibri" w:hAnsi="Calibri" w:cs="Calibri"/>
+                <w:sz w:val="14"/>
+                <w:szCs w:val="18"/>
+                <w:lang w:val="en-US"/>
+              </w:rPr>
+              <w:t>{{</w:t>
+            </w:r>
+            <w:proofErr w:type="spellStart"/>
+            <w:r>
+              <w:rPr>
+                <w:rFonts w:ascii="Calibri" w:eastAsia="Calibri" w:hAnsi="Calibri" w:cs="Calibri"/>
+                <w:sz w:val="14"/>
+                <w:szCs w:val="18"/>
+                <w:lang w:val="en-US"/>
+              </w:rPr>
+              <w:t>i.pix</w:t>
+            </w:r>
+            <w:proofErr w:type="spellEnd"/>
+            <w:r>
+              <w:rPr>
+                <w:rFonts w:ascii="Calibri" w:eastAsia="Calibri" w:hAnsi="Calibri" w:cs="Calibri"/>
+                <w:sz w:val="14"/>
+                <w:szCs w:val="18"/>
+                <w:lang w:val="en-US"/>
+              </w:rPr>
+              <w:t>}}</w:t>
+            </w:r>
+          </w:p>
+        </w:tc>
+        <w:tc>
+          <w:tcPr>
+            <w:tcW w:w="1816" w:type="dxa"/>
+          </w:tcPr>
+          <w:p>
+            <w:pPr>
+              <w:jc w:val="center"/>
+              <w:rPr>
+                <w:rFonts w:ascii="Calibri" w:hAnsi="Calibri" w:cs="Calibri"/>
+                <w:sz w:val="18"/>
+                <w:szCs w:val="18"/>
+                <w:lang w:val="en-US"/>
+              </w:rPr>
+            </w:pPr>
+            <w:r>
+              <w:rPr>
+                <w:rFonts w:ascii="Calibri" w:eastAsia="Calibri" w:hAnsi="Calibri" w:cs="Calibri"/>
+                <w:sz w:val="14"/>
+                <w:szCs w:val="18"/>
+                <w:lang w:val="en-US"/>
+              </w:rPr>
+              <w:t>{{</w:t>
+            </w:r>
+            <w:proofErr w:type="spellStart"/>
+            <w:proofErr w:type="gramStart"/>
+            <w:r>
+              <w:rPr>
+                <w:rFonts w:ascii="Calibri" w:eastAsia="Calibri" w:hAnsi="Calibri" w:cs="Calibri"/>
+                <w:sz w:val="14"/>
+                <w:szCs w:val="18"/>
+                <w:lang w:val="en-US"/>
+              </w:rPr>
+              <w:t>i.card</w:t>
+            </w:r>
+            <w:proofErr w:type="spellEnd"/>
+            <w:proofErr w:type="gramEnd"/>
+            <w:r>
+              <w:rPr>
+                <w:rFonts w:ascii="Calibri" w:eastAsia="Calibri" w:hAnsi="Calibri" w:cs="Calibri"/>
+                <w:sz w:val="14"/>
+                <w:szCs w:val="18"/>
+                <w:lang w:val="en-US"/>
+              </w:rPr>
+              <w:t>}}</w:t>
+            </w:r>
+          </w:p>
+        </w:tc>
+      </w:tr>
+      <w:tr>
+        <w:trPr>
+          <w:trHeight w:val="147"/>
+        </w:trPr>
+        <w:tc>
+          <w:tcPr>
+            <w:tcW w:w="500" w:type="dxa"/>
+            <w:vMerge/>
+          </w:tcPr>
+          <w:p>
+            <w:pPr>
+              <w:rPr>
+                <w:rFonts w:ascii="Calibri" w:hAnsi="Calibri" w:cs="Calibri"/>
+                <w:sz w:val="18"/>
+                <w:szCs w:val="18"/>
+                <w:lang w:val="en-US"/>
+              </w:rPr>
+            </w:pPr>
           </w:p>
         </w:tc>
         <w:tc>
@@ -3651,6 +3994,51 @@
           <w:p>
             <w:pPr>
               <w:rPr>
+                <w:rFonts w:ascii="Calibri" w:eastAsia="Calibri" w:hAnsi="Calibri" w:cs="Calibri"/>
+                <w:sz w:val="14"/>
+                <w:szCs w:val="18"/>
+                <w:lang w:val="en-US"/>
+              </w:rPr>
+            </w:pPr>
+            <w:r>
+              <w:rPr>
+                <w:rFonts w:ascii="Calibri" w:eastAsia="Calibri" w:hAnsi="Calibri" w:cs="Calibri"/>
+                <w:sz w:val="14"/>
+                <w:szCs w:val="14"/>
+                <w:lang w:val="en-US"/>
+              </w:rPr>
+              <w:t>{{</w:t>
+            </w:r>
+            <w:proofErr w:type="spellStart"/>
+            <w:r>
+              <w:rPr>
+                <w:rFonts w:ascii="Calibri" w:eastAsia="Calibri" w:hAnsi="Calibri" w:cs="Calibri"/>
+                <w:sz w:val="14"/>
+                <w:szCs w:val="14"/>
+                <w:lang w:val="en-US"/>
+              </w:rPr>
+              <w:t>i.h</w:t>
+            </w:r>
+            <w:proofErr w:type="spellEnd"/>
+            <w:r>
+              <w:rPr>
+                <w:rFonts w:ascii="Calibri" w:eastAsia="Calibri" w:hAnsi="Calibri" w:cs="Calibri"/>
+                <w:sz w:val="14"/>
+                <w:szCs w:val="14"/>
+                <w:lang w:val="en-US"/>
+              </w:rPr>
+              <w:t>}}</w:t>
+            </w:r>
+          </w:p>
+        </w:tc>
+        <w:tc>
+          <w:tcPr>
+            <w:tcW w:w="1961" w:type="dxa"/>
+          </w:tcPr>
+          <w:p>
+            <w:pPr>
+              <w:jc w:val="center"/>
+              <w:rPr>
                 <w:rFonts w:ascii="Calibri" w:hAnsi="Calibri" w:cs="Calibri"/>
                 <w:sz w:val="18"/>
                 <w:szCs w:val="18"/>
@@ -3661,108 +4049,85 @@
               <w:rPr>
                 <w:rFonts w:ascii="Calibri" w:eastAsia="Calibri" w:hAnsi="Calibri" w:cs="Calibri"/>
                 <w:sz w:val="14"/>
-                <w:szCs w:val="18"/>
-                <w:lang w:val="en-US"/>
-              </w:rPr>
-              <w:t>{%</w:t>
-            </w:r>
-            <w:r>
-              <w:rPr>
-                <w:rFonts w:ascii="Calibri" w:eastAsia="Calibri" w:hAnsi="Calibri" w:cs="Calibri"/>
-                <w:sz w:val="14"/>
-                <w:szCs w:val="18"/>
-                <w:lang w:val="en-US"/>
-              </w:rPr>
-              <w:t>tr</w:t>
-            </w:r>
-            <w:r>
-              <w:rPr>
-                <w:rFonts w:ascii="Calibri" w:eastAsia="Calibri" w:hAnsi="Calibri" w:cs="Calibri"/>
-                <w:sz w:val="14"/>
-                <w:szCs w:val="18"/>
-                <w:lang w:val="en-US"/>
-              </w:rPr>
-              <w:t xml:space="preserve"> for </w:t>
+                <w:szCs w:val="14"/>
+                <w:lang w:val="en-US"/>
+              </w:rPr>
+              <w:t>{{</w:t>
             </w:r>
             <w:proofErr w:type="spellStart"/>
             <w:r>
               <w:rPr>
                 <w:rFonts w:ascii="Calibri" w:eastAsia="Calibri" w:hAnsi="Calibri" w:cs="Calibri"/>
                 <w:sz w:val="14"/>
-                <w:szCs w:val="18"/>
-                <w:lang w:val="en-US"/>
-              </w:rPr>
-              <w:t>i</w:t>
+                <w:szCs w:val="14"/>
+                <w:lang w:val="en-US"/>
+              </w:rPr>
+              <w:t>i.h</w:t>
+            </w:r>
+            <w:r>
+              <w:rPr>
+                <w:rFonts w:ascii="Calibri" w:eastAsia="Calibri" w:hAnsi="Calibri" w:cs="Calibri"/>
+                <w:sz w:val="14"/>
+                <w:szCs w:val="14"/>
+                <w:lang w:val="en-US"/>
+              </w:rPr>
+              <w:t>_p</w:t>
             </w:r>
             <w:proofErr w:type="spellEnd"/>
             <w:r>
               <w:rPr>
                 <w:rFonts w:ascii="Calibri" w:eastAsia="Calibri" w:hAnsi="Calibri" w:cs="Calibri"/>
                 <w:sz w:val="14"/>
-                <w:szCs w:val="18"/>
-                <w:lang w:val="en-US"/>
-              </w:rPr>
-              <w:t xml:space="preserve"> in </w:t>
+                <w:szCs w:val="14"/>
+                <w:lang w:val="en-US"/>
+              </w:rPr>
+              <w:t>}}</w:t>
+            </w:r>
+          </w:p>
+        </w:tc>
+        <w:tc>
+          <w:tcPr>
+            <w:tcW w:w="1816" w:type="dxa"/>
+          </w:tcPr>
+          <w:p>
+            <w:pPr>
+              <w:jc w:val="center"/>
+              <w:rPr>
+                <w:rFonts w:ascii="Calibri" w:hAnsi="Calibri" w:cs="Calibri"/>
+                <w:sz w:val="18"/>
+                <w:szCs w:val="18"/>
+                <w:lang w:val="en-US"/>
+              </w:rPr>
+            </w:pPr>
+            <w:r>
+              <w:rPr>
+                <w:rFonts w:ascii="Calibri" w:hAnsi="Calibri" w:cs="Calibri"/>
+                <w:sz w:val="14"/>
+                <w:szCs w:val="14"/>
+                <w:lang w:val="en-US"/>
+              </w:rPr>
+              <w:t>{{</w:t>
             </w:r>
             <w:proofErr w:type="spellStart"/>
             <w:r>
               <w:rPr>
-                <w:rFonts w:ascii="Calibri" w:eastAsia="Calibri" w:hAnsi="Calibri" w:cs="Calibri"/>
-                <w:sz w:val="14"/>
-                <w:szCs w:val="18"/>
-                <w:lang w:val="en-US"/>
-              </w:rPr>
-              <w:t>microorganisms_</w:t>
-            </w:r>
-            <w:r>
-              <w:rPr>
-                <w:rFonts w:ascii="Calibri" w:eastAsia="Calibri" w:hAnsi="Calibri" w:cs="Calibri"/>
-                <w:sz w:val="14"/>
-                <w:szCs w:val="18"/>
-                <w:lang w:val="en-US"/>
-              </w:rPr>
-              <w:t>budget</w:t>
+                <w:rFonts w:ascii="Calibri" w:hAnsi="Calibri" w:cs="Calibri"/>
+                <w:sz w:val="14"/>
+                <w:szCs w:val="14"/>
+                <w:lang w:val="en-US"/>
+              </w:rPr>
+              <w:t>i.h_c</w:t>
             </w:r>
             <w:proofErr w:type="spellEnd"/>
             <w:r>
               <w:rPr>
-                <w:rFonts w:ascii="Calibri" w:eastAsia="Calibri" w:hAnsi="Calibri" w:cs="Calibri"/>
-                <w:sz w:val="14"/>
-                <w:szCs w:val="18"/>
-                <w:lang w:val="en-US"/>
-              </w:rPr>
-              <w:t xml:space="preserve"> %}</w:t>
-            </w:r>
-          </w:p>
-        </w:tc>
-        <w:tc>
-          <w:tcPr>
-            <w:tcW w:w="1604" w:type="dxa"/>
-          </w:tcPr>
-          <w:p>
-            <w:pPr>
-              <w:rPr>
-                <w:rFonts w:ascii="Calibri" w:hAnsi="Calibri" w:cs="Calibri"/>
-                <w:sz w:val="18"/>
-                <w:szCs w:val="18"/>
-                <w:lang w:val="en-US"/>
-              </w:rPr>
-            </w:pPr>
-          </w:p>
-        </w:tc>
-        <w:tc>
-          <w:tcPr>
-            <w:tcW w:w="2173" w:type="dxa"/>
-          </w:tcPr>
-          <w:p>
-            <w:pPr>
-              <w:rPr>
-                <w:rFonts w:ascii="Calibri" w:hAnsi="Calibri" w:cs="Calibri"/>
-                <w:sz w:val="18"/>
-                <w:szCs w:val="18"/>
-                <w:lang w:val="en-US"/>
-              </w:rPr>
-            </w:pPr>
+                <w:rFonts w:ascii="Calibri" w:hAnsi="Calibri" w:cs="Calibri"/>
+                <w:sz w:val="14"/>
+                <w:szCs w:val="14"/>
+                <w:lang w:val="en-US"/>
+              </w:rPr>
+              <w:t>}}</w:t>
+            </w:r>
           </w:p>
         </w:tc>
       </w:tr>
@@ -3776,6 +4141,278 @@
           </w:tcPr>
           <w:p>
             <w:pPr>
+              <w:rPr>
+                <w:rFonts w:ascii="Calibri" w:hAnsi="Calibri" w:cs="Calibri"/>
+                <w:sz w:val="18"/>
+                <w:szCs w:val="18"/>
+                <w:lang w:val="en-US"/>
+              </w:rPr>
+            </w:pPr>
+          </w:p>
+        </w:tc>
+        <w:tc>
+          <w:tcPr>
+            <w:tcW w:w="4480" w:type="dxa"/>
+          </w:tcPr>
+          <w:p>
+            <w:pPr>
+              <w:rPr>
+                <w:rFonts w:ascii="Calibri" w:hAnsi="Calibri" w:cs="Calibri"/>
+                <w:sz w:val="18"/>
+                <w:szCs w:val="18"/>
+                <w:lang w:val="en-US"/>
+              </w:rPr>
+            </w:pPr>
+            <w:r>
+              <w:rPr>
+                <w:rFonts w:ascii="Calibri" w:eastAsia="Calibri" w:hAnsi="Calibri" w:cs="Calibri"/>
+                <w:sz w:val="14"/>
+                <w:szCs w:val="18"/>
+                <w:lang w:val="en-US"/>
+              </w:rPr>
+              <w:t>{%</w:t>
+            </w:r>
+            <w:r>
+              <w:rPr>
+                <w:rFonts w:ascii="Calibri" w:eastAsia="Calibri" w:hAnsi="Calibri" w:cs="Calibri"/>
+                <w:sz w:val="14"/>
+                <w:szCs w:val="18"/>
+                <w:lang w:val="en-US"/>
+              </w:rPr>
+              <w:t>tr</w:t>
+            </w:r>
+            <w:r>
+              <w:rPr>
+                <w:rFonts w:ascii="Calibri" w:eastAsia="Calibri" w:hAnsi="Calibri" w:cs="Calibri"/>
+                <w:sz w:val="14"/>
+                <w:szCs w:val="18"/>
+                <w:lang w:val="en-US"/>
+              </w:rPr>
+              <w:t xml:space="preserve"> </w:t>
+            </w:r>
+            <w:proofErr w:type="spellStart"/>
+            <w:r>
+              <w:rPr>
+                <w:rFonts w:ascii="Calibri" w:eastAsia="Calibri" w:hAnsi="Calibri" w:cs="Calibri"/>
+                <w:sz w:val="14"/>
+                <w:szCs w:val="18"/>
+                <w:lang w:val="en-US"/>
+              </w:rPr>
+              <w:t>endfor</w:t>
+            </w:r>
+            <w:proofErr w:type="spellEnd"/>
+            <w:r>
+              <w:rPr>
+                <w:rFonts w:ascii="Calibri" w:eastAsia="Calibri" w:hAnsi="Calibri" w:cs="Calibri"/>
+                <w:sz w:val="14"/>
+                <w:szCs w:val="18"/>
+                <w:lang w:val="en-US"/>
+              </w:rPr>
+              <w:t xml:space="preserve"> %}</w:t>
+            </w:r>
+          </w:p>
+        </w:tc>
+        <w:tc>
+          <w:tcPr>
+            <w:tcW w:w="1961" w:type="dxa"/>
+          </w:tcPr>
+          <w:p>
+            <w:pPr>
+              <w:rPr>
+                <w:rFonts w:ascii="Calibri" w:hAnsi="Calibri" w:cs="Calibri"/>
+                <w:sz w:val="18"/>
+                <w:szCs w:val="18"/>
+                <w:lang w:val="en-US"/>
+              </w:rPr>
+            </w:pPr>
+          </w:p>
+        </w:tc>
+        <w:tc>
+          <w:tcPr>
+            <w:tcW w:w="1816" w:type="dxa"/>
+          </w:tcPr>
+          <w:p>
+            <w:pPr>
+              <w:rPr>
+                <w:rFonts w:ascii="Calibri" w:hAnsi="Calibri" w:cs="Calibri"/>
+                <w:sz w:val="18"/>
+                <w:szCs w:val="18"/>
+                <w:lang w:val="en-US"/>
+              </w:rPr>
+            </w:pPr>
+          </w:p>
+        </w:tc>
+      </w:tr>
+      <w:tr>
+        <w:trPr>
+          <w:trHeight w:val="49"/>
+        </w:trPr>
+        <w:tc>
+          <w:tcPr>
+            <w:tcW w:w="500" w:type="dxa"/>
+          </w:tcPr>
+          <w:p>
+            <w:pPr>
+              <w:rPr>
+                <w:rFonts w:ascii="Calibri" w:hAnsi="Calibri" w:cs="Calibri"/>
+                <w:sz w:val="18"/>
+                <w:szCs w:val="18"/>
+                <w:lang w:val="en-US"/>
+              </w:rPr>
+            </w:pPr>
+          </w:p>
+        </w:tc>
+        <w:tc>
+          <w:tcPr>
+            <w:tcW w:w="4480" w:type="dxa"/>
+          </w:tcPr>
+          <w:p>
+            <w:pPr>
+              <w:rPr>
+                <w:rFonts w:ascii="Calibri" w:hAnsi="Calibri" w:cs="Calibri"/>
+                <w:sz w:val="18"/>
+                <w:szCs w:val="18"/>
+                <w:lang w:val="en-US"/>
+              </w:rPr>
+            </w:pPr>
+            <w:r>
+              <w:rPr>
+                <w:rFonts w:ascii="Calibri" w:eastAsia="Calibri" w:hAnsi="Calibri" w:cs="Calibri"/>
+                <w:sz w:val="14"/>
+                <w:szCs w:val="18"/>
+                <w:lang w:val="en-US"/>
+              </w:rPr>
+              <w:t>{%</w:t>
+            </w:r>
+            <w:r>
+              <w:rPr>
+                <w:rFonts w:ascii="Calibri" w:eastAsia="Calibri" w:hAnsi="Calibri" w:cs="Calibri"/>
+                <w:sz w:val="14"/>
+                <w:szCs w:val="18"/>
+                <w:lang w:val="en-US"/>
+              </w:rPr>
+              <w:t>tr</w:t>
+            </w:r>
+            <w:r>
+              <w:rPr>
+                <w:rFonts w:ascii="Calibri" w:eastAsia="Calibri" w:hAnsi="Calibri" w:cs="Calibri"/>
+                <w:sz w:val="14"/>
+                <w:szCs w:val="18"/>
+                <w:lang w:val="en-US"/>
+              </w:rPr>
+              <w:t xml:space="preserve"> for </w:t>
+            </w:r>
+            <w:proofErr w:type="spellStart"/>
+            <w:r>
+              <w:rPr>
+                <w:rFonts w:ascii="Calibri" w:eastAsia="Calibri" w:hAnsi="Calibri" w:cs="Calibri"/>
+                <w:sz w:val="14"/>
+                <w:szCs w:val="18"/>
+                <w:lang w:val="en-US"/>
+              </w:rPr>
+              <w:t>i</w:t>
+            </w:r>
+            <w:proofErr w:type="spellEnd"/>
+            <w:r>
+              <w:rPr>
+                <w:rFonts w:ascii="Calibri" w:eastAsia="Calibri" w:hAnsi="Calibri" w:cs="Calibri"/>
+                <w:sz w:val="14"/>
+                <w:szCs w:val="18"/>
+                <w:lang w:val="en-US"/>
+              </w:rPr>
+              <w:t xml:space="preserve"> in </w:t>
+            </w:r>
+            <w:proofErr w:type="spellStart"/>
+            <w:r>
+              <w:rPr>
+                <w:rFonts w:ascii="Calibri" w:eastAsia="Calibri" w:hAnsi="Calibri" w:cs="Calibri"/>
+                <w:sz w:val="14"/>
+                <w:szCs w:val="18"/>
+                <w:lang w:val="en-US"/>
+              </w:rPr>
+              <w:t>m</w:t>
+            </w:r>
+            <w:r>
+              <w:rPr>
+                <w:rFonts w:ascii="Calibri" w:eastAsia="Calibri" w:hAnsi="Calibri" w:cs="Calibri"/>
+                <w:sz w:val="14"/>
+                <w:szCs w:val="18"/>
+                <w:lang w:val="en-US"/>
+              </w:rPr>
+              <w:t>etals</w:t>
+            </w:r>
+            <w:r>
+              <w:rPr>
+                <w:rFonts w:ascii="Calibri" w:eastAsia="Calibri" w:hAnsi="Calibri" w:cs="Calibri"/>
+                <w:sz w:val="14"/>
+                <w:szCs w:val="18"/>
+                <w:lang w:val="en-US"/>
+              </w:rPr>
+              <w:t>_</w:t>
+            </w:r>
+            <w:r>
+              <w:rPr>
+                <w:rFonts w:ascii="Calibri" w:eastAsia="Calibri" w:hAnsi="Calibri" w:cs="Calibri"/>
+                <w:sz w:val="14"/>
+                <w:szCs w:val="18"/>
+                <w:lang w:val="en-US"/>
+              </w:rPr>
+              <w:t>budget</w:t>
+            </w:r>
+            <w:proofErr w:type="spellEnd"/>
+            <w:r>
+              <w:rPr>
+                <w:rFonts w:ascii="Calibri" w:eastAsia="Calibri" w:hAnsi="Calibri" w:cs="Calibri"/>
+                <w:sz w:val="14"/>
+                <w:szCs w:val="18"/>
+                <w:lang w:val="en-US"/>
+              </w:rPr>
+              <w:t xml:space="preserve"> %}</w:t>
+            </w:r>
+          </w:p>
+        </w:tc>
+        <w:tc>
+          <w:tcPr>
+            <w:tcW w:w="1961" w:type="dxa"/>
+          </w:tcPr>
+          <w:p>
+            <w:pPr>
+              <w:rPr>
+                <w:rFonts w:ascii="Calibri" w:hAnsi="Calibri" w:cs="Calibri"/>
+                <w:sz w:val="18"/>
+                <w:szCs w:val="18"/>
+                <w:lang w:val="en-US"/>
+              </w:rPr>
+            </w:pPr>
+          </w:p>
+        </w:tc>
+        <w:tc>
+          <w:tcPr>
+            <w:tcW w:w="1816" w:type="dxa"/>
+          </w:tcPr>
+          <w:p>
+            <w:pPr>
+              <w:rPr>
+                <w:rFonts w:ascii="Calibri" w:hAnsi="Calibri" w:cs="Calibri"/>
+                <w:sz w:val="18"/>
+                <w:szCs w:val="18"/>
+                <w:lang w:val="en-US"/>
+              </w:rPr>
+            </w:pPr>
+          </w:p>
+        </w:tc>
+      </w:tr>
+      <w:tr>
+        <w:trPr>
+          <w:trHeight w:val="384"/>
+        </w:trPr>
+        <w:tc>
+          <w:tcPr>
+            <w:tcW w:w="500" w:type="dxa"/>
+            <w:vMerge w:val="restart"/>
+          </w:tcPr>
+          <w:p>
+            <w:pPr>
               <w:jc w:val="center"/>
             </w:pPr>
             <w:r>
@@ -3854,7 +4491,7 @@
         </w:tc>
         <w:tc>
           <w:tcPr>
-            <w:tcW w:w="1604" w:type="dxa"/>
+            <w:tcW w:w="1961" w:type="dxa"/>
           </w:tcPr>
           <w:p>
             <w:pPr>
@@ -3899,7 +4536,7 @@
         </w:tc>
         <w:tc>
           <w:tcPr>
-            <w:tcW w:w="2173" w:type="dxa"/>
+            <w:tcW w:w="1816" w:type="dxa"/>
           </w:tcPr>
           <w:p>
             <w:pPr>
@@ -3938,6 +4575,170 @@
                 <w:rFonts w:ascii="Calibri" w:eastAsia="Calibri" w:hAnsi="Calibri" w:cs="Calibri"/>
                 <w:sz w:val="14"/>
                 <w:szCs w:val="18"/>
+                <w:lang w:val="en-US"/>
+              </w:rPr>
+              <w:t>}}</w:t>
+            </w:r>
+          </w:p>
+        </w:tc>
+      </w:tr>
+      <w:tr>
+        <w:trPr>
+          <w:trHeight w:val="49"/>
+        </w:trPr>
+        <w:tc>
+          <w:tcPr>
+            <w:tcW w:w="500" w:type="dxa"/>
+            <w:vMerge/>
+          </w:tcPr>
+          <w:p>
+            <w:pPr>
+              <w:rPr>
+                <w:rFonts w:ascii="Calibri" w:hAnsi="Calibri" w:cs="Calibri"/>
+                <w:sz w:val="14"/>
+                <w:szCs w:val="14"/>
+                <w:lang w:val="en-US"/>
+              </w:rPr>
+            </w:pPr>
+          </w:p>
+        </w:tc>
+        <w:tc>
+          <w:tcPr>
+            <w:tcW w:w="4480" w:type="dxa"/>
+          </w:tcPr>
+          <w:p>
+            <w:pPr>
+              <w:rPr>
+                <w:rFonts w:ascii="Calibri" w:eastAsia="Calibri" w:hAnsi="Calibri" w:cs="Calibri"/>
+                <w:sz w:val="14"/>
+                <w:szCs w:val="14"/>
+                <w:lang w:val="en-US"/>
+              </w:rPr>
+            </w:pPr>
+            <w:r>
+              <w:rPr>
+                <w:rFonts w:ascii="Calibri" w:eastAsia="Calibri" w:hAnsi="Calibri" w:cs="Calibri"/>
+                <w:sz w:val="14"/>
+                <w:szCs w:val="14"/>
+                <w:lang w:val="en-US"/>
+              </w:rPr>
+              <w:t>{{</w:t>
+            </w:r>
+            <w:proofErr w:type="spellStart"/>
+            <w:r>
+              <w:rPr>
+                <w:rFonts w:ascii="Calibri" w:eastAsia="Calibri" w:hAnsi="Calibri" w:cs="Calibri"/>
+                <w:sz w:val="14"/>
+                <w:szCs w:val="14"/>
+                <w:lang w:val="en-US"/>
+              </w:rPr>
+              <w:t>i.h</w:t>
+            </w:r>
+            <w:proofErr w:type="spellEnd"/>
+            <w:r>
+              <w:rPr>
+                <w:rFonts w:ascii="Calibri" w:eastAsia="Calibri" w:hAnsi="Calibri" w:cs="Calibri"/>
+                <w:sz w:val="14"/>
+                <w:szCs w:val="14"/>
+                <w:lang w:val="en-US"/>
+              </w:rPr>
+              <w:t>}}</w:t>
+            </w:r>
+          </w:p>
+        </w:tc>
+        <w:tc>
+          <w:tcPr>
+            <w:tcW w:w="1961" w:type="dxa"/>
+          </w:tcPr>
+          <w:p>
+            <w:pPr>
+              <w:jc w:val="center"/>
+              <w:rPr>
+                <w:rFonts w:ascii="Calibri" w:hAnsi="Calibri" w:cs="Calibri"/>
+                <w:sz w:val="14"/>
+                <w:szCs w:val="14"/>
+                <w:lang w:val="en-US"/>
+              </w:rPr>
+            </w:pPr>
+            <w:r>
+              <w:rPr>
+                <w:rFonts w:ascii="Calibri" w:eastAsia="Calibri" w:hAnsi="Calibri" w:cs="Calibri"/>
+                <w:sz w:val="14"/>
+                <w:szCs w:val="14"/>
+                <w:lang w:val="en-US"/>
+              </w:rPr>
+              <w:t>{{</w:t>
+            </w:r>
+            <w:proofErr w:type="spellStart"/>
+            <w:r>
+              <w:rPr>
+                <w:rFonts w:ascii="Calibri" w:eastAsia="Calibri" w:hAnsi="Calibri" w:cs="Calibri"/>
+                <w:sz w:val="14"/>
+                <w:szCs w:val="14"/>
+                <w:lang w:val="en-US"/>
+              </w:rPr>
+              <w:t>i.h</w:t>
+            </w:r>
+            <w:r>
+              <w:rPr>
+                <w:rFonts w:ascii="Calibri" w:eastAsia="Calibri" w:hAnsi="Calibri" w:cs="Calibri"/>
+                <w:sz w:val="14"/>
+                <w:szCs w:val="14"/>
+                <w:lang w:val="en-US"/>
+              </w:rPr>
+              <w:t>_c</w:t>
+            </w:r>
+            <w:proofErr w:type="spellEnd"/>
+            <w:r>
+              <w:rPr>
+                <w:rFonts w:ascii="Calibri" w:eastAsia="Calibri" w:hAnsi="Calibri" w:cs="Calibri"/>
+                <w:sz w:val="14"/>
+                <w:szCs w:val="14"/>
+                <w:lang w:val="en-US"/>
+              </w:rPr>
+              <w:t>}}</w:t>
+            </w:r>
+          </w:p>
+        </w:tc>
+        <w:tc>
+          <w:tcPr>
+            <w:tcW w:w="1816" w:type="dxa"/>
+          </w:tcPr>
+          <w:p>
+            <w:pPr>
+              <w:jc w:val="center"/>
+              <w:rPr>
+                <w:rFonts w:ascii="Calibri" w:hAnsi="Calibri" w:cs="Calibri"/>
+                <w:sz w:val="14"/>
+                <w:szCs w:val="14"/>
+                <w:lang w:val="en-US"/>
+              </w:rPr>
+            </w:pPr>
+            <w:r>
+              <w:rPr>
+                <w:rFonts w:ascii="Calibri" w:hAnsi="Calibri" w:cs="Calibri"/>
+                <w:sz w:val="14"/>
+                <w:szCs w:val="14"/>
+                <w:lang w:val="en-US"/>
+              </w:rPr>
+              <w:t>{{</w:t>
+            </w:r>
+            <w:proofErr w:type="spellStart"/>
+            <w:r>
+              <w:rPr>
+                <w:rFonts w:ascii="Calibri" w:hAnsi="Calibri" w:cs="Calibri"/>
+                <w:sz w:val="14"/>
+                <w:szCs w:val="14"/>
+                <w:lang w:val="en-US"/>
+              </w:rPr>
+              <w:t>i.h_c</w:t>
+            </w:r>
+            <w:proofErr w:type="spellEnd"/>
+            <w:r>
+              <w:rPr>
+                <w:rFonts w:ascii="Calibri" w:hAnsi="Calibri" w:cs="Calibri"/>
+                <w:sz w:val="14"/>
+                <w:szCs w:val="14"/>
                 <w:lang w:val="en-US"/>
               </w:rPr>
               <w:t>}}</w:t>
@@ -4028,7 +4829,7 @@
         </w:tc>
         <w:tc>
           <w:tcPr>
-            <w:tcW w:w="1604" w:type="dxa"/>
+            <w:tcW w:w="1961" w:type="dxa"/>
           </w:tcPr>
           <w:p>
             <w:pPr>
@@ -4043,7 +4844,7 @@
         </w:tc>
         <w:tc>
           <w:tcPr>
-            <w:tcW w:w="2173" w:type="dxa"/>
+            <w:tcW w:w="1816" w:type="dxa"/>
           </w:tcPr>
           <w:p>
             <w:pPr>
@@ -4054,121 +4855,22 @@
                 <w:lang w:val="en-US"/>
               </w:rPr>
             </w:pPr>
-          </w:p>
-        </w:tc>
-      </w:tr>
-    </w:tbl>
-    <w:p>
-      <w:pPr>
-        <w:rPr>
-          <w:lang w:val="en-US"/>
-        </w:rPr>
-      </w:pPr>
-    </w:p>
-    <w:tbl>
-      <w:tblPr>
-        <w:tblStyle w:val="TableGrid0"/>
-        <w:tblW w:w="0" w:type="auto"/>
-        <w:tblLayout w:type="fixed"/>
-        <w:tblLook w:val="04A0" w:firstRow="1" w:lastRow="0" w:firstColumn="1" w:lastColumn="0" w:noHBand="0" w:noVBand="1"/>
-      </w:tblPr>
-      <w:tblGrid>
-        <w:gridCol w:w="500"/>
-        <w:gridCol w:w="4480"/>
-        <w:gridCol w:w="1604"/>
-        <w:gridCol w:w="2173"/>
-      </w:tblGrid>
-      <w:tr>
-        <w:trPr>
-          <w:trHeight w:val="328"/>
-        </w:trPr>
-        <w:tc>
-          <w:tcPr>
-            <w:tcW w:w="4480" w:type="dxa"/>
-            <w:gridSpan w:val="2"/>
-            <w:shd w:val="clear" w:color="auto" w:fill="DAE9F7" w:themeFill="text2" w:themeFillTint="1A"/>
-          </w:tcPr>
-          <w:p>
-            <w:pPr>
-              <w:jc w:val="center"/>
-              <w:rPr>
-                <w:rFonts w:ascii="Calibri" w:hAnsi="Calibri" w:cs="Calibri"/>
-                <w:sz w:val="20"/>
-                <w:szCs w:val="20"/>
-              </w:rPr>
-            </w:pPr>
-            <w:r>
-              <w:rPr>
-                <w:rFonts w:ascii="Calibri" w:eastAsia="Calibri" w:hAnsi="Calibri" w:cs="Calibri"/>
-                <w:b/>
-                <w:sz w:val="20"/>
-                <w:szCs w:val="20"/>
-              </w:rPr>
-              <w:t>PROTOCOLO METAIS</w:t>
-            </w:r>
-          </w:p>
-        </w:tc>
-        <w:tc>
-          <w:tcPr>
-            <w:tcW w:w="1604" w:type="dxa"/>
-            <w:shd w:val="clear" w:color="auto" w:fill="DAE9F7" w:themeFill="text2" w:themeFillTint="1A"/>
-          </w:tcPr>
-          <w:p>
-            <w:pPr>
-              <w:jc w:val="center"/>
-              <w:rPr>
-                <w:rFonts w:ascii="Calibri" w:hAnsi="Calibri" w:cs="Calibri"/>
-                <w:sz w:val="20"/>
-                <w:szCs w:val="20"/>
-              </w:rPr>
-            </w:pPr>
-            <w:r>
-              <w:rPr>
-                <w:rFonts w:ascii="Calibri" w:eastAsia="Calibri" w:hAnsi="Calibri" w:cs="Calibri"/>
-                <w:b/>
-                <w:sz w:val="20"/>
-                <w:szCs w:val="20"/>
-              </w:rPr>
-              <w:t>Pix</w:t>
-            </w:r>
-          </w:p>
-        </w:tc>
-        <w:tc>
-          <w:tcPr>
-            <w:tcW w:w="2173" w:type="dxa"/>
-            <w:shd w:val="clear" w:color="auto" w:fill="DAE9F7" w:themeFill="text2" w:themeFillTint="1A"/>
-          </w:tcPr>
-          <w:p>
-            <w:pPr>
-              <w:jc w:val="center"/>
-              <w:rPr>
-                <w:rFonts w:ascii="Calibri" w:hAnsi="Calibri" w:cs="Calibri"/>
-                <w:sz w:val="20"/>
-                <w:szCs w:val="20"/>
-              </w:rPr>
-            </w:pPr>
-            <w:r>
-              <w:rPr>
-                <w:rFonts w:ascii="Calibri" w:eastAsia="Calibri" w:hAnsi="Calibri" w:cs="Calibri"/>
-                <w:b/>
-                <w:sz w:val="20"/>
-                <w:szCs w:val="20"/>
-              </w:rPr>
-              <w:t>Cartão</w:t>
-            </w:r>
           </w:p>
         </w:tc>
       </w:tr>
       <w:tr>
         <w:trPr>
-          <w:trHeight w:val="328"/>
+          <w:trHeight w:val="438"/>
         </w:trPr>
         <w:tc>
           <w:tcPr>
-            <w:tcW w:w="500" w:type="dxa"/>
-          </w:tcPr>
-          <w:p>
-            <w:pPr>
+            <w:tcW w:w="4980" w:type="dxa"/>
+            <w:gridSpan w:val="2"/>
+            <w:shd w:val="clear" w:color="auto" w:fill="DAE9F7" w:themeFill="text2" w:themeFillTint="1A"/>
+          </w:tcPr>
+          <w:p>
+            <w:pPr>
+              <w:jc w:val="center"/>
               <w:rPr>
                 <w:rFonts w:ascii="Calibri" w:hAnsi="Calibri" w:cs="Calibri"/>
                 <w:sz w:val="18"/>
@@ -4176,16 +4878,41 @@
                 <w:lang w:val="en-US"/>
               </w:rPr>
             </w:pPr>
-          </w:p>
-        </w:tc>
-        <w:tc>
-          <w:tcPr>
-            <w:tcW w:w="4480" w:type="dxa"/>
-          </w:tcPr>
-          <w:p>
-            <w:pPr>
-              <w:rPr>
-                <w:rFonts w:ascii="Calibri" w:hAnsi="Calibri" w:cs="Calibri"/>
+            <w:r>
+              <w:rPr>
+                <w:rFonts w:ascii="Calibri" w:eastAsia="Calibri" w:hAnsi="Calibri" w:cs="Calibri"/>
+                <w:b/>
+                <w:sz w:val="14"/>
+                <w:szCs w:val="18"/>
+                <w:lang w:val="en-US"/>
+              </w:rPr>
+              <w:t xml:space="preserve">Total </w:t>
+            </w:r>
+            <w:r>
+              <w:rPr>
+                <w:rFonts w:ascii="Calibri" w:eastAsia="Calibri" w:hAnsi="Calibri" w:cs="Calibri"/>
+                <w:b/>
+                <w:sz w:val="14"/>
+                <w:szCs w:val="18"/>
+                <w:lang w:val="en-US"/>
+              </w:rPr>
+              <w:t>Pix</w:t>
+            </w:r>
+          </w:p>
+        </w:tc>
+        <w:tc>
+          <w:tcPr>
+            <w:tcW w:w="3777" w:type="dxa"/>
+            <w:gridSpan w:val="2"/>
+            <w:shd w:val="clear" w:color="auto" w:fill="DAE9F7" w:themeFill="text2" w:themeFillTint="1A"/>
+          </w:tcPr>
+          <w:p>
+            <w:pPr>
+              <w:jc w:val="center"/>
+              <w:rPr>
+                <w:rFonts w:ascii="Calibri" w:hAnsi="Calibri" w:cs="Calibri"/>
+                <w:b/>
+                <w:bCs/>
                 <w:sz w:val="18"/>
                 <w:szCs w:val="18"/>
                 <w:lang w:val="en-US"/>
@@ -4194,178 +4921,94 @@
             <w:r>
               <w:rPr>
                 <w:rFonts w:ascii="Calibri" w:eastAsia="Calibri" w:hAnsi="Calibri" w:cs="Calibri"/>
-                <w:sz w:val="14"/>
-                <w:szCs w:val="18"/>
-                <w:lang w:val="en-US"/>
-              </w:rPr>
-              <w:t>{%</w:t>
-            </w:r>
-            <w:r>
-              <w:rPr>
-                <w:rFonts w:ascii="Calibri" w:eastAsia="Calibri" w:hAnsi="Calibri" w:cs="Calibri"/>
-                <w:sz w:val="14"/>
-                <w:szCs w:val="18"/>
-                <w:lang w:val="en-US"/>
-              </w:rPr>
-              <w:t>tr</w:t>
-            </w:r>
-            <w:r>
-              <w:rPr>
-                <w:rFonts w:ascii="Calibri" w:eastAsia="Calibri" w:hAnsi="Calibri" w:cs="Calibri"/>
-                <w:sz w:val="14"/>
-                <w:szCs w:val="18"/>
-                <w:lang w:val="en-US"/>
-              </w:rPr>
-              <w:t xml:space="preserve"> for </w:t>
+                <w:b/>
+                <w:bCs/>
+                <w:sz w:val="14"/>
+                <w:szCs w:val="18"/>
+                <w:lang w:val="en-US"/>
+              </w:rPr>
+              <w:t>{{</w:t>
             </w:r>
             <w:proofErr w:type="spellStart"/>
             <w:r>
               <w:rPr>
                 <w:rFonts w:ascii="Calibri" w:eastAsia="Calibri" w:hAnsi="Calibri" w:cs="Calibri"/>
-                <w:sz w:val="14"/>
-                <w:szCs w:val="18"/>
-                <w:lang w:val="en-US"/>
-              </w:rPr>
-              <w:t>i</w:t>
+                <w:b/>
+                <w:bCs/>
+                <w:sz w:val="14"/>
+                <w:szCs w:val="18"/>
+                <w:lang w:val="en-US"/>
+              </w:rPr>
+              <w:t>total_pix</w:t>
             </w:r>
             <w:proofErr w:type="spellEnd"/>
             <w:r>
               <w:rPr>
                 <w:rFonts w:ascii="Calibri" w:eastAsia="Calibri" w:hAnsi="Calibri" w:cs="Calibri"/>
-                <w:sz w:val="14"/>
-                <w:szCs w:val="18"/>
-                <w:lang w:val="en-US"/>
-              </w:rPr>
-              <w:t xml:space="preserve"> in </w:t>
-            </w:r>
-            <w:proofErr w:type="spellStart"/>
-            <w:r>
-              <w:rPr>
-                <w:rFonts w:ascii="Calibri" w:eastAsia="Calibri" w:hAnsi="Calibri" w:cs="Calibri"/>
-                <w:sz w:val="14"/>
-                <w:szCs w:val="18"/>
-                <w:lang w:val="en-US"/>
-              </w:rPr>
-              <w:t>m</w:t>
-            </w:r>
-            <w:r>
-              <w:rPr>
-                <w:rFonts w:ascii="Calibri" w:eastAsia="Calibri" w:hAnsi="Calibri" w:cs="Calibri"/>
-                <w:sz w:val="14"/>
-                <w:szCs w:val="18"/>
-                <w:lang w:val="en-US"/>
-              </w:rPr>
-              <w:t>etals</w:t>
-            </w:r>
-            <w:r>
-              <w:rPr>
-                <w:rFonts w:ascii="Calibri" w:eastAsia="Calibri" w:hAnsi="Calibri" w:cs="Calibri"/>
-                <w:sz w:val="14"/>
-                <w:szCs w:val="18"/>
-                <w:lang w:val="en-US"/>
-              </w:rPr>
-              <w:t>_</w:t>
-            </w:r>
-            <w:r>
-              <w:rPr>
-                <w:rFonts w:ascii="Calibri" w:eastAsia="Calibri" w:hAnsi="Calibri" w:cs="Calibri"/>
-                <w:sz w:val="14"/>
-                <w:szCs w:val="18"/>
-                <w:lang w:val="en-US"/>
-              </w:rPr>
-              <w:t>budget</w:t>
-            </w:r>
-            <w:proofErr w:type="spellEnd"/>
-            <w:r>
-              <w:rPr>
-                <w:rFonts w:ascii="Calibri" w:eastAsia="Calibri" w:hAnsi="Calibri" w:cs="Calibri"/>
-                <w:sz w:val="14"/>
-                <w:szCs w:val="18"/>
-                <w:lang w:val="en-US"/>
-              </w:rPr>
-              <w:t xml:space="preserve"> %}</w:t>
-            </w:r>
-          </w:p>
-        </w:tc>
-        <w:tc>
-          <w:tcPr>
-            <w:tcW w:w="1604" w:type="dxa"/>
-          </w:tcPr>
-          <w:p>
-            <w:pPr>
-              <w:rPr>
-                <w:rFonts w:ascii="Calibri" w:hAnsi="Calibri" w:cs="Calibri"/>
-                <w:sz w:val="18"/>
-                <w:szCs w:val="18"/>
-                <w:lang w:val="en-US"/>
-              </w:rPr>
-            </w:pPr>
-          </w:p>
-        </w:tc>
-        <w:tc>
-          <w:tcPr>
-            <w:tcW w:w="2173" w:type="dxa"/>
-          </w:tcPr>
-          <w:p>
-            <w:pPr>
-              <w:rPr>
-                <w:rFonts w:ascii="Calibri" w:hAnsi="Calibri" w:cs="Calibri"/>
-                <w:sz w:val="18"/>
-                <w:szCs w:val="18"/>
-                <w:lang w:val="en-US"/>
-              </w:rPr>
-            </w:pPr>
+                <w:b/>
+                <w:bCs/>
+                <w:sz w:val="14"/>
+                <w:szCs w:val="18"/>
+                <w:lang w:val="en-US"/>
+              </w:rPr>
+              <w:t>}}</w:t>
+            </w:r>
           </w:p>
         </w:tc>
       </w:tr>
       <w:tr>
         <w:trPr>
-          <w:trHeight w:val="328"/>
+          <w:trHeight w:val="438"/>
         </w:trPr>
         <w:tc>
           <w:tcPr>
-            <w:tcW w:w="500" w:type="dxa"/>
-          </w:tcPr>
-          <w:p>
-            <w:pPr>
-              <w:jc w:val="center"/>
-            </w:pPr>
-            <w:r>
-              <w:rPr>
-                <w:rFonts w:ascii="Calibri" w:eastAsia="Calibri" w:hAnsi="Calibri"/>
+            <w:tcW w:w="4980" w:type="dxa"/>
+            <w:gridSpan w:val="2"/>
+            <w:shd w:val="clear" w:color="auto" w:fill="DAE9F7" w:themeFill="text2" w:themeFillTint="1A"/>
+          </w:tcPr>
+          <w:p>
+            <w:pPr>
+              <w:jc w:val="center"/>
+              <w:rPr>
+                <w:rFonts w:ascii="Calibri" w:hAnsi="Calibri" w:cs="Calibri"/>
+                <w:sz w:val="18"/>
+                <w:szCs w:val="18"/>
+                <w:lang w:val="en-US"/>
+              </w:rPr>
+            </w:pPr>
+            <w:r>
+              <w:rPr>
+                <w:rFonts w:ascii="Calibri" w:eastAsia="Calibri" w:hAnsi="Calibri" w:cs="Calibri"/>
                 <w:b/>
                 <w:sz w:val="14"/>
-              </w:rPr>
-              <w:t>{{</w:t>
+                <w:szCs w:val="18"/>
+                <w:lang w:val="en-US"/>
+              </w:rPr>
+              <w:t xml:space="preserve">Total </w:t>
             </w:r>
             <w:proofErr w:type="spellStart"/>
-            <w:proofErr w:type="gramStart"/>
-            <w:r>
-              <w:rPr>
-                <w:rFonts w:ascii="Calibri" w:eastAsia="Calibri" w:hAnsi="Calibri"/>
+            <w:r>
+              <w:rPr>
+                <w:rFonts w:ascii="Calibri" w:eastAsia="Calibri" w:hAnsi="Calibri" w:cs="Calibri"/>
                 <w:b/>
                 <w:sz w:val="14"/>
-              </w:rPr>
-              <w:t>i.number</w:t>
+                <w:szCs w:val="18"/>
+                <w:lang w:val="en-US"/>
+              </w:rPr>
+              <w:t>Cartão</w:t>
             </w:r>
             <w:proofErr w:type="spellEnd"/>
-            <w:proofErr w:type="gramEnd"/>
-            <w:r>
-              <w:rPr>
-                <w:rFonts w:ascii="Calibri" w:eastAsia="Calibri" w:hAnsi="Calibri"/>
-                <w:b/>
-                <w:sz w:val="14"/>
-              </w:rPr>
-              <w:t>}}</w:t>
-            </w:r>
-          </w:p>
-        </w:tc>
-        <w:tc>
-          <w:tcPr>
-            <w:tcW w:w="4480" w:type="dxa"/>
-          </w:tcPr>
-          <w:p>
-            <w:pPr>
+          </w:p>
+        </w:tc>
+        <w:tc>
+          <w:tcPr>
+            <w:tcW w:w="3777" w:type="dxa"/>
+            <w:gridSpan w:val="2"/>
+            <w:shd w:val="clear" w:color="auto" w:fill="DAE9F7" w:themeFill="text2" w:themeFillTint="1A"/>
+          </w:tcPr>
+          <w:p>
+            <w:pPr>
+              <w:jc w:val="center"/>
               <w:rPr>
                 <w:rFonts w:ascii="Calibri" w:hAnsi="Calibri" w:cs="Calibri"/>
                 <w:b/>
@@ -4378,234 +5021,38 @@
             <w:r>
               <w:rPr>
                 <w:rFonts w:ascii="Calibri" w:eastAsia="Calibri" w:hAnsi="Calibri" w:cs="Calibri"/>
-                <w:sz w:val="14"/>
-                <w:szCs w:val="18"/>
-                <w:lang w:val="en-US"/>
-              </w:rPr>
-              <w:t>{{i</w:t>
-            </w:r>
-            <w:r>
-              <w:rPr>
-                <w:rFonts w:ascii="Calibri" w:eastAsia="Calibri" w:hAnsi="Calibri" w:cs="Calibri"/>
-                <w:sz w:val="14"/>
-                <w:szCs w:val="18"/>
-                <w:lang w:val="en-US"/>
-              </w:rPr>
-              <w:t>.name</w:t>
-            </w:r>
-            <w:r>
-              <w:rPr>
-                <w:rFonts w:ascii="Calibri" w:eastAsia="Calibri" w:hAnsi="Calibri" w:cs="Calibri"/>
+                <w:b/>
+                <w:bCs/>
+                <w:sz w:val="14"/>
+                <w:szCs w:val="18"/>
+                <w:lang w:val="en-US"/>
+              </w:rPr>
+              <w:t>{{</w:t>
+            </w:r>
+            <w:proofErr w:type="spellStart"/>
+            <w:r>
+              <w:rPr>
+                <w:rFonts w:ascii="Calibri" w:eastAsia="Calibri" w:hAnsi="Calibri" w:cs="Calibri"/>
+                <w:b/>
+                <w:bCs/>
+                <w:sz w:val="14"/>
+                <w:szCs w:val="18"/>
+                <w:lang w:val="en-US"/>
+              </w:rPr>
+              <w:t>total_card</w:t>
+            </w:r>
+            <w:proofErr w:type="spellEnd"/>
+            <w:r>
+              <w:rPr>
+                <w:rFonts w:ascii="Calibri" w:eastAsia="Calibri" w:hAnsi="Calibri" w:cs="Calibri"/>
+                <w:b/>
+                <w:bCs/>
                 <w:sz w:val="14"/>
                 <w:szCs w:val="18"/>
                 <w:lang w:val="en-US"/>
               </w:rPr>
               <w:t>}}</w:t>
             </w:r>
-          </w:p>
-        </w:tc>
-        <w:tc>
-          <w:tcPr>
-            <w:tcW w:w="1604" w:type="dxa"/>
-          </w:tcPr>
-          <w:p>
-            <w:pPr>
-              <w:jc w:val="center"/>
-              <w:rPr>
-                <w:rFonts w:ascii="Calibri" w:hAnsi="Calibri" w:cs="Calibri"/>
-                <w:sz w:val="18"/>
-                <w:szCs w:val="18"/>
-                <w:lang w:val="en-US"/>
-              </w:rPr>
-            </w:pPr>
-            <w:r>
-              <w:rPr>
-                <w:rFonts w:ascii="Calibri" w:eastAsia="Calibri" w:hAnsi="Calibri" w:cs="Calibri"/>
-                <w:sz w:val="14"/>
-                <w:szCs w:val="18"/>
-                <w:lang w:val="en-US"/>
-              </w:rPr>
-              <w:t>{{</w:t>
-            </w:r>
-            <w:proofErr w:type="spellStart"/>
-            <w:r>
-              <w:rPr>
-                <w:rFonts w:ascii="Calibri" w:eastAsia="Calibri" w:hAnsi="Calibri" w:cs="Calibri"/>
-                <w:sz w:val="14"/>
-                <w:szCs w:val="18"/>
-                <w:lang w:val="en-US"/>
-              </w:rPr>
-              <w:t>i.pix</w:t>
-            </w:r>
-            <w:proofErr w:type="spellEnd"/>
-            <w:r>
-              <w:rPr>
-                <w:rFonts w:ascii="Calibri" w:eastAsia="Calibri" w:hAnsi="Calibri" w:cs="Calibri"/>
-                <w:sz w:val="14"/>
-                <w:szCs w:val="18"/>
-                <w:lang w:val="en-US"/>
-              </w:rPr>
-              <w:t>}}</w:t>
-            </w:r>
-          </w:p>
-        </w:tc>
-        <w:tc>
-          <w:tcPr>
-            <w:tcW w:w="2173" w:type="dxa"/>
-          </w:tcPr>
-          <w:p>
-            <w:pPr>
-              <w:jc w:val="center"/>
-              <w:rPr>
-                <w:rFonts w:ascii="Calibri" w:hAnsi="Calibri" w:cs="Calibri"/>
-                <w:sz w:val="18"/>
-                <w:szCs w:val="18"/>
-                <w:lang w:val="en-US"/>
-              </w:rPr>
-            </w:pPr>
-            <w:r>
-              <w:rPr>
-                <w:rFonts w:ascii="Calibri" w:eastAsia="Calibri" w:hAnsi="Calibri" w:cs="Calibri"/>
-                <w:sz w:val="14"/>
-                <w:szCs w:val="18"/>
-                <w:lang w:val="en-US"/>
-              </w:rPr>
-              <w:t>{{</w:t>
-            </w:r>
-            <w:proofErr w:type="spellStart"/>
-            <w:proofErr w:type="gramStart"/>
-            <w:r>
-              <w:rPr>
-                <w:rFonts w:ascii="Calibri" w:eastAsia="Calibri" w:hAnsi="Calibri" w:cs="Calibri"/>
-                <w:sz w:val="14"/>
-                <w:szCs w:val="18"/>
-                <w:lang w:val="en-US"/>
-              </w:rPr>
-              <w:t>i.card</w:t>
-            </w:r>
-            <w:proofErr w:type="spellEnd"/>
-            <w:proofErr w:type="gramEnd"/>
-            <w:r>
-              <w:rPr>
-                <w:rFonts w:ascii="Calibri" w:eastAsia="Calibri" w:hAnsi="Calibri" w:cs="Calibri"/>
-                <w:sz w:val="14"/>
-                <w:szCs w:val="18"/>
-                <w:lang w:val="en-US"/>
-              </w:rPr>
-              <w:t>}}</w:t>
-            </w:r>
-          </w:p>
-        </w:tc>
-      </w:tr>
-      <w:tr>
-        <w:trPr>
-          <w:trHeight w:val="328"/>
-        </w:trPr>
-        <w:tc>
-          <w:tcPr>
-            <w:tcW w:w="500" w:type="dxa"/>
-          </w:tcPr>
-          <w:p>
-            <w:pPr>
-              <w:rPr>
-                <w:rFonts w:ascii="Calibri" w:hAnsi="Calibri" w:cs="Calibri"/>
-                <w:sz w:val="18"/>
-                <w:szCs w:val="18"/>
-                <w:lang w:val="en-US"/>
-              </w:rPr>
-            </w:pPr>
-          </w:p>
-        </w:tc>
-        <w:tc>
-          <w:tcPr>
-            <w:tcW w:w="4480" w:type="dxa"/>
-          </w:tcPr>
-          <w:p>
-            <w:pPr>
-              <w:rPr>
-                <w:rFonts w:ascii="Calibri" w:hAnsi="Calibri" w:cs="Calibri"/>
-                <w:sz w:val="18"/>
-                <w:szCs w:val="18"/>
-                <w:lang w:val="en-US"/>
-              </w:rPr>
-            </w:pPr>
-            <w:r>
-              <w:rPr>
-                <w:rFonts w:ascii="Calibri" w:eastAsia="Calibri" w:hAnsi="Calibri" w:cs="Calibri"/>
-                <w:sz w:val="14"/>
-                <w:szCs w:val="18"/>
-                <w:lang w:val="en-US"/>
-              </w:rPr>
-              <w:t>{%</w:t>
-            </w:r>
-            <w:r>
-              <w:rPr>
-                <w:rFonts w:ascii="Calibri" w:eastAsia="Calibri" w:hAnsi="Calibri" w:cs="Calibri"/>
-                <w:sz w:val="14"/>
-                <w:szCs w:val="18"/>
-                <w:lang w:val="en-US"/>
-              </w:rPr>
-              <w:t>tr</w:t>
-            </w:r>
-            <w:r>
-              <w:rPr>
-                <w:rFonts w:ascii="Calibri" w:eastAsia="Calibri" w:hAnsi="Calibri" w:cs="Calibri"/>
-                <w:sz w:val="14"/>
-                <w:szCs w:val="18"/>
-                <w:lang w:val="en-US"/>
-              </w:rPr>
-              <w:t xml:space="preserve"> </w:t>
-            </w:r>
-            <w:proofErr w:type="spellStart"/>
-            <w:r>
-              <w:rPr>
-                <w:rFonts w:ascii="Calibri" w:eastAsia="Calibri" w:hAnsi="Calibri" w:cs="Calibri"/>
-                <w:sz w:val="14"/>
-                <w:szCs w:val="18"/>
-                <w:lang w:val="en-US"/>
-              </w:rPr>
-              <w:t>endfor</w:t>
-            </w:r>
-            <w:proofErr w:type="spellEnd"/>
-            <w:r>
-              <w:rPr>
-                <w:rFonts w:ascii="Calibri" w:eastAsia="Calibri" w:hAnsi="Calibri" w:cs="Calibri"/>
-                <w:sz w:val="14"/>
-                <w:szCs w:val="18"/>
-                <w:lang w:val="en-US"/>
-              </w:rPr>
-              <w:t xml:space="preserve"> %}</w:t>
-            </w:r>
-          </w:p>
-        </w:tc>
-        <w:tc>
-          <w:tcPr>
-            <w:tcW w:w="1604" w:type="dxa"/>
-          </w:tcPr>
-          <w:p>
-            <w:pPr>
-              <w:rPr>
-                <w:rFonts w:ascii="Calibri" w:hAnsi="Calibri" w:cs="Calibri"/>
-                <w:sz w:val="18"/>
-                <w:szCs w:val="18"/>
-                <w:lang w:val="en-US"/>
-              </w:rPr>
-            </w:pPr>
-          </w:p>
-        </w:tc>
-        <w:tc>
-          <w:tcPr>
-            <w:tcW w:w="2173" w:type="dxa"/>
-          </w:tcPr>
-          <w:p>
-            <w:pPr>
-              <w:rPr>
-                <w:rFonts w:ascii="Calibri" w:hAnsi="Calibri" w:cs="Calibri"/>
-                <w:sz w:val="18"/>
-                <w:szCs w:val="18"/>
-                <w:lang w:val="en-US"/>
-              </w:rPr>
-            </w:pPr>
           </w:p>
         </w:tc>
       </w:tr>
@@ -6854,7 +7301,7 @@
   <w:style w:type="paragraph" w:default="1" w:styleId="Normal">
     <w:name w:val="Normal"/>
     <w:qFormat/>
-    <w:rsid w:val="00114410"/>
+    <w:rsid w:val="00F36309"/>
   </w:style>
   <w:style w:type="paragraph" w:styleId="Heading1">
     <w:name w:val="heading 1"/>

</xml_diff>